<commit_message>
edit(report): sharpen Aave collateral framing to role, not asset class
On Aave every reserve is collateral-eligible, so "collateral, not
stablecoins" was imprecise and collided with sUSDe (a stablecoin supplied
as collateral). Reframed to the role distinction: the assets people post
to borrow against grew (LRT, BTC-variant, and yield-bearing
synthetic-dollar collateral incl. sUSDe), while the base stablecoins lent
for yield (USDC, USDT) and WETH drained. Even inside stablecoins,
collateral dollars grew and lending dollars shrank. Applied across
sections 01/03/04.1, the distribution article, and the Datum Labs + Joel
thread legs; all four docx rebuilt.

Co-Authored-By: Claude Opus 4.8 <noreply@anthropic.com>
</commit_message>
<xml_diff>
--- a/content/reports/distribution/Issue_004_Article.docx
+++ b/content/reports/distribution/Issue_004_Article.docx
@@ -87,33 +87,46 @@
           <w:sz w:val="28"/>
           <w:szCs w:val="28"/>
         </w:rPr>
-        <w:t xml:space="preserve">The growth was collateral</w:t>
-      </w:r>
-    </w:p>
-    <w:p>
-      <w:pPr>
-        <w:spacing w:after="220"/>
-      </w:pPr>
-      <w:r>
-        <w:rPr>
-          <w:rFonts w:ascii="Cambria" w:cs="Cambria" w:eastAsia="Cambria" w:hAnsi="Cambria"/>
-          <w:sz w:val="22"/>
-          <w:szCs w:val="22"/>
-        </w:rPr>
-        <w:t xml:space="preserve">Aave V3's inflow did not arrive in stablecoins. USDC on the protocol shed $20M in July, a smaller drain than June's −$162M but the same direction. USDT shed $62M and WETH shed $29M. Against those, the collateral reserves grew: weETH +$285M, sUSDe +$145M, WBTC +$124M, wstETH +$113M, cbBTC +$63M.</w:t>
-      </w:r>
-    </w:p>
-    <w:p>
-      <w:pPr>
-        <w:spacing w:after="220"/>
-      </w:pPr>
-      <w:r>
-        <w:rPr>
-          <w:rFonts w:ascii="Cambria" w:cs="Cambria" w:eastAsia="Cambria" w:hAnsi="Cambria"/>
-          <w:sz w:val="22"/>
-          <w:szCs w:val="22"/>
-        </w:rPr>
-        <w:t xml:space="preserve">Inside the liquid restaking complex the flow was concentrated in weETH at +$285M, while rsETH shed $93M over the same month. The rsETH outflow was specific to that token and does not read as a broader restaking rotation. The stablecoin picture is similar underneath the headline drain: combined outflow across USDC, USDT, and a maturing Pendle sUSDe reserve totaled roughly −$110M, while combined inflow across sUSDe, USDe, USDTB, and a longer-dated Pendle sUSDe forward totaled roughly +$255M. Net stablecoin position grew about +$145M, but the growth landed in the USDe complex, Ethena's synthetic dollar and its tokenized forwards, while USDC and USDT drained.</w:t>
+        <w:t xml:space="preserve">Aave grew on collateral, not on its base stablecoin supply</w:t>
+      </w:r>
+    </w:p>
+    <w:p>
+      <w:pPr>
+        <w:spacing w:after="220"/>
+      </w:pPr>
+      <w:r>
+        <w:rPr>
+          <w:rFonts w:ascii="Cambria" w:cs="Cambria" w:eastAsia="Cambria" w:hAnsi="Cambria"/>
+          <w:sz w:val="22"/>
+          <w:szCs w:val="22"/>
+        </w:rPr>
+        <w:t xml:space="preserve">Aave V3's inflow arrived in the assets people post to borrow against, not in the assets people lend to earn a supply rate. USDC on the protocol shed $20M in July, a smaller drain than June's −$162M but the same direction. USDT shed $62M and WETH shed $29M. Against those, the volatile collateral reserves grew: weETH +$285M, WBTC +$124M, wstETH +$113M, cbBTC +$63M. Alongside them, sUSDe grew +$145M. sUSDe is a stablecoin by asset class, but on Aave it functions as collateral for Ethena carry trades rather than as lending supply.</w:t>
+      </w:r>
+    </w:p>
+    <w:p>
+      <w:pPr>
+        <w:spacing w:after="220"/>
+      </w:pPr>
+      <w:r>
+        <w:rPr>
+          <w:rFonts w:ascii="Cambria" w:cs="Cambria" w:eastAsia="Cambria" w:hAnsi="Cambria"/>
+          <w:sz w:val="22"/>
+          <w:szCs w:val="22"/>
+        </w:rPr>
+        <w:t xml:space="preserve">Inside the liquid restaking complex, the flow was concentrated in weETH at +$285M while rsETH shed $93M over the same month. That reads as a within-token rotation rather than a broader restaking move.</w:t>
+      </w:r>
+    </w:p>
+    <w:p>
+      <w:pPr>
+        <w:spacing w:after="220"/>
+      </w:pPr>
+      <w:r>
+        <w:rPr>
+          <w:rFonts w:ascii="Cambria" w:cs="Cambria" w:eastAsia="Cambria" w:hAnsi="Cambria"/>
+          <w:sz w:val="22"/>
+          <w:szCs w:val="22"/>
+        </w:rPr>
+        <w:t xml:space="preserve">The stablecoin picture has the same shape underneath the headline drain. Combined outflow across USDC, USDT, and a maturing Pendle sUSDe reserve totaled roughly −$110M. Combined inflow across sUSDe, USDe, USDTB, and a longer-dated Pendle sUSDe forward totaled roughly +$255M. Net stablecoin position grew about +$145M, but the growth landed in the USDe complex, Ethena's synthetic dollar and its tokenized forwards, while USDC and USDT drained.</w:t>
       </w:r>
     </w:p>
     <w:p>
@@ -339,7 +352,7 @@
         </w:rPr>
         <w:t xml:space="preserve">The full report, with the daily flow series, the six protocol sections, and the complete rate and curator tables: </w:t>
       </w:r>
-      <w:hyperlink w:history="1" r:id="rIdvieczz3fnjsq-2bc6hw35">
+      <w:hyperlink w:history="1" r:id="rIdoimczfrdolu_zxemnojt0">
         <w:r>
           <w:rPr>
             <w:rStyle w:val="Hyperlink"/>

</xml_diff>

<commit_message>
fix(distribution): correct SparkLend Sky-anchored framing in the article + mini-post
The X/LinkedIn article's SparkLend section and the LinkedIn mini-post still
carried the wrong "rates set by Sky governance, not pool utilization"
framing plus the "all five stepped ~18 bps" and "markup narrowed from
0.71pp" errors. Rewritten to the verified Sky-anchored utilization-curve
framing: per-reserve steps (DAI/USDS 18.4, USDC 13.8, PYUSD 8, USDT 48.6),
markup widened 0.52pp -> 0.56pp, and the like-for-like caveat reframed to
"SparkLend's rate carries a Sky-anchored base on top of its utilization
curve." All four docx rebuilt (article now 1,426 words, 0 em dashes).

Co-Authored-By: Claude Opus 4.8 <noreply@anthropic.com>
</commit_message>
<xml_diff>
--- a/content/reports/distribution/Issue_004_Article.docx
+++ b/content/reports/distribution/Issue_004_Article.docx
@@ -225,46 +225,46 @@
           <w:sz w:val="28"/>
           <w:szCs w:val="28"/>
         </w:rPr>
-        <w:t xml:space="preserve">SparkLend's stablecoin rates now move with Sky governance</w:t>
-      </w:r>
-    </w:p>
-    <w:p>
-      <w:pPr>
-        <w:spacing w:after="220"/>
-      </w:pPr>
-      <w:r>
-        <w:rPr>
-          <w:rFonts w:ascii="Cambria" w:cs="Cambria" w:eastAsia="Cambria" w:hAnsi="Cambria"/>
-          <w:sz w:val="22"/>
-          <w:szCs w:val="22"/>
-        </w:rPr>
-        <w:t xml:space="preserve">Five of SparkLend's 18 reserves, all stablecoins, price their borrow rate from Sky governance rather than from pool utilization. On July 23 at 14:43 UTC, Sky's weekly Atlas Edit executive spell executed on-chain and cut the Sky Base Rate, the wholesale cost of the USDS inventory SparkLend lends against as a Sky Agent, from 3.90% to 3.72%, an 18 bps step. SparkLend's on-chain USDC retail borrow rate stepped from 4.42% to 4.28% in the same transaction cycle.</w:t>
-      </w:r>
-    </w:p>
-    <w:p>
-      <w:pPr>
-        <w:spacing w:after="220"/>
-      </w:pPr>
-      <w:r>
-        <w:rPr>
-          <w:rFonts w:ascii="Cambria" w:cs="Cambria" w:eastAsia="Cambria" w:hAnsi="Cambria"/>
-          <w:sz w:val="22"/>
-          <w:szCs w:val="22"/>
-        </w:rPr>
-        <w:t xml:space="preserve">The five Sky-linked reserves are DAI, USDC, USDT, USDS, and PYUSD. On-chain reads show all five point their variable-rate model at a single Sky-linked rate source contract at 0x57027B62, which references sUSDS and derives from the Base Rate. All five stepped roughly 18 bps on July 23. None of SparkLend's other 13 reserves, the collateral book of WETH, wstETH, WBTC and the rest, moved that day; they clear on standard Aave-shape utilization curves. SparkLend is a hybrid: a Sky-priced stablecoin book bolted onto an Aave-style collateral book.</w:t>
-      </w:r>
-    </w:p>
-    <w:p>
-      <w:pPr>
-        <w:spacing w:after="220"/>
-      </w:pPr>
-      <w:r>
-        <w:rPr>
-          <w:rFonts w:ascii="Cambria" w:cs="Cambria" w:eastAsia="Cambria" w:hAnsi="Cambria"/>
-          <w:sz w:val="22"/>
-          <w:szCs w:val="22"/>
-        </w:rPr>
-        <w:t xml:space="preserve">An earlier step on July 6 cut USDC from 4.61% to 4.42%, but the Base Rate did not move that day and the other four Sky-linked stablecoins held. July 6 was SparkLend compressing its own markup over the wholesale rate; July 23 was Sky cutting the wholesale rate itself. The markup narrowed from 0.71 pp on July 22 to 0.56 pp on July 23. The mechanism matters for any cross-protocol rate read. Comparing Fluid's 4.66% USDC supply APY to SparkLend's 3.47% is not a like-for-like: one rate reflects lender-borrower matching, the other reflects a Sky governance decision.</w:t>
+        <w:t xml:space="preserve">SparkLend's stablecoin rates carry a Sky-anchored base</w:t>
+      </w:r>
+    </w:p>
+    <w:p>
+      <w:pPr>
+        <w:spacing w:after="220"/>
+      </w:pPr>
+      <w:r>
+        <w:rPr>
+          <w:rFonts w:ascii="Cambria" w:cs="Cambria" w:eastAsia="Cambria" w:hAnsi="Cambria"/>
+          <w:sz w:val="22"/>
+          <w:szCs w:val="22"/>
+        </w:rPr>
+        <w:t xml:space="preserve">Five of SparkLend's 18 reserves, all stablecoins, price their borrow rate off a utilization curve whose base rate is anchored to a Sky-linked rate source rather than fixed at listing, so the rate responds to both pool utilization and Sky governance. On July 23 at 14:43 UTC, Sky's weekly Atlas Edit executive spell executed on-chain and cut the Sky Base Rate, the wholesale cost of the USDS inventory SparkLend lends against as a Sky Agent, from 3.90% to 3.72%, an 18 bps step. SparkLend's on-chain USDC retail borrow rate stepped from 4.42% to 4.28% in the same transaction cycle, passing through 14 of the 18 bps.</w:t>
+      </w:r>
+    </w:p>
+    <w:p>
+      <w:pPr>
+        <w:spacing w:after="220"/>
+      </w:pPr>
+      <w:r>
+        <w:rPr>
+          <w:rFonts w:ascii="Cambria" w:cs="Cambria" w:eastAsia="Cambria" w:hAnsi="Cambria"/>
+          <w:sz w:val="22"/>
+          <w:szCs w:val="22"/>
+        </w:rPr>
+        <w:t xml:space="preserve">The five Sky-linked reserves are DAI, USDC, USDT, USDS, and PYUSD. On-chain reads show all five point their variable-rate model at a single Sky-linked rate source contract at 0x57027B62, which references sUSDS and supplies the curve's base rate. The step sizes varied by reserve: DAI and USDS moved 18.4 bps with utilization roughly flat, USDC 13.8 bps, PYUSD 8 bps, and USDT 48.6 bps because its utilization also fell from 93.0% to 83.6% that day. SparkLend's other 13 reserves, the collateral book of WETH, wstETH, WBTC and the rest, run the same Aave-shape utilization curves but with base rates fixed at listing, so they did not move on July 23. SparkLend is a hybrid: a Sky-anchored stablecoin book and a listing-fixed collateral book, both clearing on utilization curves.</w:t>
+      </w:r>
+    </w:p>
+    <w:p>
+      <w:pPr>
+        <w:spacing w:after="220"/>
+      </w:pPr>
+      <w:r>
+        <w:rPr>
+          <w:rFonts w:ascii="Cambria" w:cs="Cambria" w:eastAsia="Cambria" w:hAnsi="Cambria"/>
+          <w:sz w:val="22"/>
+          <w:szCs w:val="22"/>
+        </w:rPr>
+        <w:t xml:space="preserve">An earlier step on July 6 cut USDC from 4.61% to 4.42%, but the Base Rate did not move that day and the other four Sky-linked stablecoins held. July 6 was SparkLend adjusting its own markup over the wholesale rate; July 23 was Sky moving the wholesale anchor. SparkLend's markup over the Sky Base Rate widened from 0.52 pp on July 22 to 0.56 pp on July 23, since it passed through 14 of the 18 bps and absorbed the rest. The mechanism matters for any cross-protocol rate read. Comparing Fluid's 4.66% USDC supply APY to SparkLend's 3.47% is not a clean like-for-like: SparkLend's rate carries a Sky-anchored base on top of its utilization curve, so it can shift on days its utilization has not.</w:t>
       </w:r>
     </w:p>
     <w:p>
@@ -352,7 +352,7 @@
         </w:rPr>
         <w:t xml:space="preserve">The full report, with the daily flow series, the six protocol sections, and the complete rate and curator tables: </w:t>
       </w:r>
-      <w:hyperlink w:history="1" r:id="rIdoimczfrdolu_zxemnojt0">
+      <w:hyperlink w:history="1" r:id="rIdiapvs-ba4by5tvjusn4xq">
         <w:r>
           <w:rPr>
             <w:rStyle w:val="Hyperlink"/>

</xml_diff>